<commit_message>
chore(mgmt): redesign all 9 DOCX sample templates
- Rebuild receipt, receipt-work, certificate, samaan, consent (loaner &
  guarantor) and report (en/hi/both) samples with the committee logo as a
  header + faint full-page watermark.
- Page sizes: A5 for receipts & material, A4 landscape for certificate,
  A4 portrait for consent forms and reports.
- Embed the full bilingual (Hindi/English) loaner & guarantor consent text
  with all placeholders (day names, guarantor counts, festival dates).
- Add {%QR_CODE} to every receipt/certificate/consent template.
- Remove DESIGNATION and MOBILE from receipts/certificate (privacy: these
  are downloadable from the public portal).
- Make receipt vs receipt-work distinct; drop signature blocks and add a
  'digitally generated, scan QR to verify' note.
- Templates verified to render through docxtemplater + image module.
- Copies kept identical in both the React (public) and Svelte (static) apps.
</commit_message>
<xml_diff>
--- a/mgmt/frontend-svelte/static/sample-templates/certificate-sample.docx
+++ b/mgmt/frontend-svelte/static/sample-templates/certificate-sample.docx
@@ -4,16 +4,111 @@
   <w:body>
     <w:p>
       <w:pPr>
+        <w:spacing w:after="40"/>
+        <w:jc w:val="center"/>
+      </w:pPr>
+      <w:r>
+        <w:drawing>
+          <wp:inline xmlns:a="http://schemas.openxmlformats.org/drawingml/2006/main" xmlns:pic="http://schemas.openxmlformats.org/drawingml/2006/picture">
+            <wp:extent cx="936000" cy="936000"/>
+            <wp:docPr id="1" name="Picture 1"/>
+            <wp:cNvGraphicFramePr>
+              <a:graphicFrameLocks noChangeAspect="1"/>
+            </wp:cNvGraphicFramePr>
+            <a:graphic>
+              <a:graphicData uri="http://schemas.openxmlformats.org/drawingml/2006/picture">
+                <pic:pic>
+                  <pic:nvPicPr>
+                    <pic:cNvPr id="0" name="logo.png"/>
+                    <pic:cNvPicPr/>
+                  </pic:nvPicPr>
+                  <pic:blipFill>
+                    <a:blip r:embed="rId10"/>
+                    <a:stretch>
+                      <a:fillRect/>
+                    </a:stretch>
+                  </pic:blipFill>
+                  <pic:spPr>
+                    <a:xfrm>
+                      <a:off x="0" y="0"/>
+                      <a:ext cx="936000" cy="936000"/>
+                    </a:xfrm>
+                    <a:prstGeom prst="rect"/>
+                  </pic:spPr>
+                </pic:pic>
+              </a:graphicData>
+            </a:graphic>
+          </wp:inline>
+        </w:drawing>
+      </w:r>
+    </w:p>
+    <w:p>
+      <w:pPr>
+        <w:spacing w:after="0" w:before="0"/>
         <w:jc w:val="center"/>
       </w:pPr>
       <w:r>
         <w:rPr>
           <w:b/>
-          <w:color w:val="F27A1A"/>
-          <w:sz w:val="40"/>
+          <w:i w:val="0"/>
+          <w:color w:val="8B1E1E"/>
+          <w:sz w:val="30"/>
         </w:rPr>
         <w:t>नवयुवक छठ पूजा समिति</w:t>
       </w:r>
+    </w:p>
+    <w:p>
+      <w:pPr>
+        <w:spacing w:after="40" w:before="0"/>
+        <w:jc w:val="center"/>
+      </w:pPr>
+      <w:r>
+        <w:rPr>
+          <w:b/>
+          <w:i w:val="0"/>
+          <w:color w:val="F1922A"/>
+          <w:sz w:val="20"/>
+        </w:rPr>
+        <w:t>NAVYUVAK CHHATH PUJA SAMITI · EST. 2017</w:t>
+      </w:r>
+    </w:p>
+    <w:p>
+      <w:pPr>
+        <w:spacing w:after="0" w:before="0"/>
+        <w:jc w:val="center"/>
+      </w:pPr>
+      <w:r>
+        <w:rPr>
+          <w:b/>
+          <w:i w:val="0"/>
+          <w:color w:val="222222"/>
+          <w:sz w:val="26"/>
+        </w:rPr>
+        <w:t>प्रमाण पत्र</w:t>
+      </w:r>
+    </w:p>
+    <w:p>
+      <w:pPr>
+        <w:spacing w:after="40" w:before="0"/>
+        <w:jc w:val="center"/>
+      </w:pPr>
+      <w:r>
+        <w:rPr>
+          <w:b/>
+          <w:i w:val="0"/>
+          <w:color w:val="555555"/>
+          <w:sz w:val="22"/>
+        </w:rPr>
+        <w:t>CERTIFICATE OF CONTRIBUTION</w:t>
+      </w:r>
+    </w:p>
+    <w:p>
+      <w:pPr>
+        <w:spacing w:after="80" w:before="40"/>
+        <w:pBdr>
+          <w:bottom w:val="single" w:sz="6" w:space="1" w:color="E0C99B"/>
+        </w:pBdr>
+      </w:pPr>
     </w:p>
     <w:p>
       <w:pPr>
@@ -21,197 +116,231 @@
       </w:pPr>
       <w:r>
         <w:rPr>
-          <w:sz w:val="22"/>
+          <w:color w:val="555555"/>
+          <w:sz w:val="21"/>
         </w:rPr>
-        <w:t>NAVYUVAK CHHATH PUJA SAMITI</w:t>
+        <w:t>Certificate No / प्रमाण पत्र सं.: {CERT_NO}          Date / दिनांक: {DATE}</w:t>
       </w:r>
     </w:p>
     <w:p>
       <w:pPr>
+        <w:spacing w:after="80" w:before="0"/>
+      </w:pPr>
+    </w:p>
+    <w:p>
+      <w:pPr>
+        <w:spacing w:after="40" w:before="0"/>
+        <w:jc w:val="center"/>
+      </w:pPr>
+      <w:r>
+        <w:rPr>
+          <w:b w:val="0"/>
+          <w:i w:val="0"/>
+          <w:sz w:val="26"/>
+        </w:rPr>
+        <w:t>यह प्रमाणित किया जाता है कि</w:t>
+      </w:r>
+    </w:p>
+    <w:p>
+      <w:pPr>
+        <w:spacing w:after="120" w:before="0"/>
+        <w:jc w:val="center"/>
+      </w:pPr>
+      <w:r>
+        <w:rPr>
+          <w:b w:val="0"/>
+          <w:i/>
+          <w:color w:val="555555"/>
+          <w:sz w:val="20"/>
+        </w:rPr>
+        <w:t>This is to certify that</w:t>
+      </w:r>
+    </w:p>
+    <w:p>
+      <w:pPr>
+        <w:spacing w:after="40" w:before="0"/>
         <w:jc w:val="center"/>
       </w:pPr>
       <w:r>
         <w:rPr>
           <w:b/>
-          <w:sz w:val="26"/>
+          <w:i w:val="0"/>
+          <w:color w:val="8B1E1E"/>
+          <w:sz w:val="36"/>
         </w:rPr>
-        <w:t>प्रमाण पत्र / CERTIFICATE OF APPRECIATION</w:t>
+        <w:t>{NAME},  S/o  {FATHER_NAME}</w:t>
       </w:r>
     </w:p>
-    <w:p/>
-    <w:tbl>
-      <w:tblPr>
-        <w:tblW w:type="auto" w:w="0"/>
-        <w:tblLook w:firstColumn="1" w:firstRow="1" w:lastColumn="0" w:lastRow="0" w:noHBand="0" w:noVBand="1" w:val="04A0"/>
-      </w:tblPr>
-      <w:tblGrid>
-        <w:gridCol w:w="4819"/>
-        <w:gridCol w:w="4819"/>
-      </w:tblGrid>
-      <w:tr>
-        <w:tc>
-          <w:tcPr>
-            <w:tcW w:type="dxa" w:w="4819"/>
-          </w:tcPr>
-          <w:p>
-            <w:r>
-              <w:t>Certificate No: {CERT_NO}</w:t>
-            </w:r>
-          </w:p>
-        </w:tc>
-        <w:tc>
-          <w:tcPr>
-            <w:tcW w:type="dxa" w:w="4819"/>
-          </w:tcPr>
-          <w:p>
-            <w:r>
-              <w:t>Date: {DATE}</w:t>
-            </w:r>
-          </w:p>
-        </w:tc>
-      </w:tr>
-    </w:tbl>
-    <w:p/>
     <w:p>
       <w:pPr>
+        <w:spacing w:after="120" w:before="0"/>
         <w:jc w:val="center"/>
       </w:pPr>
       <w:r>
         <w:rPr>
+          <w:b w:val="0"/>
+          <w:i w:val="0"/>
           <w:sz w:val="24"/>
         </w:rPr>
-        <w:t>यह प्रमाणित किया जाता है कि / This is to certify that</w:t>
+        <w:t>Village / गाँव: {VILLAGE}</w:t>
       </w:r>
     </w:p>
     <w:p>
       <w:pPr>
+        <w:spacing w:after="40" w:before="0"/>
         <w:jc w:val="center"/>
       </w:pPr>
       <w:r>
         <w:rPr>
-          <w:b/>
-          <w:color w:val="F27A1A"/>
-          <w:sz w:val="44"/>
+          <w:b w:val="0"/>
+          <w:i w:val="0"/>
+          <w:sz w:val="26"/>
         </w:rPr>
-        <w:t>{NAME}</w:t>
+        <w:t>ने वर्ष {YEAR} के लिए अपना योगदान दिया है।</w:t>
       </w:r>
     </w:p>
     <w:p>
       <w:pPr>
+        <w:spacing w:after="120" w:before="0"/>
         <w:jc w:val="center"/>
       </w:pPr>
       <w:r>
         <w:rPr>
-          <w:sz w:val="22"/>
+          <w:b w:val="0"/>
+          <w:i/>
+          <w:color w:val="555555"/>
+          <w:sz w:val="20"/>
         </w:rPr>
-        <w:t>ने वर्ष {YEAR} की छठ पूजा में निम्न कार्य में अपना योगदान दिया / contributed to the following work:</w:t>
+        <w:t>has contributed for the year {YEAR}.</w:t>
       </w:r>
     </w:p>
-    <w:p/>
     <w:p>
       <w:pPr>
+        <w:spacing w:after="160" w:before="0"/>
         <w:jc w:val="center"/>
       </w:pPr>
       <w:r>
         <w:rPr>
-          <w:b/>
-          <w:sz w:val="28"/>
+          <w:b w:val="0"/>
+          <w:i w:val="0"/>
+          <w:sz w:val="22"/>
         </w:rPr>
-        <w:t>{DETAIL}</w:t>
+        <w:t>Details / विवरण: {DETAIL}</w:t>
       </w:r>
     </w:p>
-    <w:p/>
-    <w:tbl>
-      <w:tblPr>
-        <w:tblStyle w:val="TableGrid"/>
-        <w:tblW w:type="auto" w:w="0"/>
-        <w:tblLook w:firstColumn="1" w:firstRow="1" w:lastColumn="0" w:lastRow="0" w:noHBand="0" w:noVBand="1" w:val="04A0"/>
-      </w:tblPr>
-      <w:tblGrid>
-        <w:gridCol w:w="4819"/>
-        <w:gridCol w:w="4819"/>
-      </w:tblGrid>
-      <w:tr>
-        <w:tc>
-          <w:tcPr>
-            <w:tcW w:type="dxa" w:w="4819"/>
-          </w:tcPr>
-          <w:p>
-            <w:r>
-              <w:rPr>
-                <w:b/>
-              </w:rPr>
-              <w:t>Village</w:t>
-            </w:r>
-          </w:p>
-        </w:tc>
-        <w:tc>
-          <w:tcPr>
-            <w:tcW w:type="dxa" w:w="4819"/>
-          </w:tcPr>
-          <w:p>
-            <w:r>
-              <w:t>{VILLAGE}</w:t>
-            </w:r>
-          </w:p>
-        </w:tc>
-      </w:tr>
-      <w:tr>
-        <w:tc>
-          <w:tcPr>
-            <w:tcW w:type="dxa" w:w="4819"/>
-          </w:tcPr>
-          <w:p>
-            <w:r>
-              <w:rPr>
-                <w:b/>
-              </w:rPr>
-              <w:t>Father's Name</w:t>
-            </w:r>
-          </w:p>
-        </w:tc>
-        <w:tc>
-          <w:tcPr>
-            <w:tcW w:type="dxa" w:w="4819"/>
-          </w:tcPr>
-          <w:p>
-            <w:r>
-              <w:t>{FATHER_NAME}</w:t>
-            </w:r>
-          </w:p>
-        </w:tc>
-      </w:tr>
-    </w:tbl>
-    <w:p/>
     <w:p>
       <w:pPr>
-        <w:jc w:val="center"/>
-      </w:pPr>
-      <w:r>
-        <w:t>समिति की ओर से हार्दिक धन्यवाद एवं शुभकामनाएं। / With heartfelt thanks and best wishes.</w:t>
-      </w:r>
-    </w:p>
-    <w:p/>
-    <w:p>
-      <w:pPr>
+        <w:spacing w:before="120" w:after="40"/>
         <w:jc w:val="center"/>
       </w:pPr>
       <w:r>
         <w:rPr>
-          <w:color w:val="888888"/>
+          <w:color w:val="555555"/>
+          <w:sz w:val="18"/>
+        </w:rPr>
+        <w:t>{%QR_CODE}</w:t>
+      </w:r>
+    </w:p>
+    <w:p>
+      <w:pPr>
+        <w:spacing w:after="0" w:before="0"/>
+        <w:jc w:val="center"/>
+      </w:pPr>
+      <w:r>
+        <w:rPr>
+          <w:b w:val="0"/>
+          <w:i w:val="0"/>
+          <w:color w:val="555555"/>
+          <w:sz w:val="17"/>
+        </w:rPr>
+        <w:t>यह प्रमाण पत्र डिजिटल रूप से जनरेट किया गया है, अतः किसी हस्ताक्षर की आवश्यकता नहीं है। प्रामाणिकता जाँचने हेतु QR कोड स्कैन करें।</w:t>
+      </w:r>
+    </w:p>
+    <w:p>
+      <w:pPr>
+        <w:spacing w:after="40" w:before="0"/>
+        <w:jc w:val="center"/>
+      </w:pPr>
+      <w:r>
+        <w:rPr>
+          <w:b w:val="0"/>
+          <w:i/>
+          <w:color w:val="555555"/>
           <w:sz w:val="16"/>
         </w:rPr>
-        <w:t>Generated at / जनरेट किया गया: {GENERATED_AT}</w:t>
+        <w:t>This certificate is digitally generated, so no signature is required. Scan the QR code to verify authenticity.</w:t>
+      </w:r>
+    </w:p>
+    <w:p>
+      <w:pPr>
+        <w:spacing w:after="80" w:before="40"/>
+        <w:jc w:val="center"/>
+      </w:pPr>
+      <w:r>
+        <w:rPr>
+          <w:b w:val="0"/>
+          <w:i w:val="0"/>
+          <w:color w:val="555555"/>
+          <w:sz w:val="16"/>
+        </w:rPr>
+        <w:t>Generated at: {GENERATED_AT}</w:t>
       </w:r>
     </w:p>
     <w:sectPr>
-      <w:pgSz w:w="11906" w:h="16838"/>
-      <w:pgMar w:top="1134" w:right="1134" w:bottom="1134" w:left="1134" w:header="720" w:footer="720" w:gutter="0"/>
+      <w:headerReference w:type="default" r:id="rId9"/>
+      <w:pgSz w:w="16838" w:h="11906" w:orient="landscape"/>
+      <w:pgMar w:top="1134" w:right="1134" w:bottom="1134" w:left="1134" w:header="340" w:footer="720" w:gutter="0"/>
       <w:cols w:space="720"/>
       <w:docGrid w:linePitch="360"/>
     </w:sectPr>
   </w:body>
 </w:document>
+</file>
+
+<file path=word/header1.xml><?xml version="1.0" encoding="utf-8"?>
+<w:hdr xmlns:m="http://schemas.openxmlformats.org/officeDocument/2006/math" xmlns:mc="http://schemas.openxmlformats.org/markup-compatibility/2006" xmlns:mo="http://schemas.microsoft.com/office/mac/office/2008/main" xmlns:mv="urn:schemas-microsoft-com:mac:vml" xmlns:o="urn:schemas-microsoft-com:office:office" xmlns:r="http://schemas.openxmlformats.org/officeDocument/2006/relationships" xmlns:v="urn:schemas-microsoft-com:vml" xmlns:w10="urn:schemas-microsoft-com:office:word" xmlns:w14="http://schemas.microsoft.com/office/word/2010/wordml" xmlns:w="http://schemas.openxmlformats.org/wordprocessingml/2006/main" xmlns:wne="http://schemas.microsoft.com/office/word/2006/wordml" xmlns:wp14="http://schemas.microsoft.com/office/word/2010/wordprocessingDrawing" xmlns:wp="http://schemas.openxmlformats.org/drawingml/2006/wordprocessingDrawing" xmlns:wpc="http://schemas.microsoft.com/office/word/2010/wordprocessingCanvas" xmlns:wpg="http://schemas.microsoft.com/office/word/2010/wordprocessingGroup" xmlns:wpi="http://schemas.microsoft.com/office/word/2010/wordprocessingInk" xmlns:wps="http://schemas.microsoft.com/office/word/2010/wordprocessingShape" mc:Ignorable="w14 wp14">
+  <w:p>
+    <w:pPr>
+      <w:pStyle w:val="Header"/>
+      <w:jc w:val="center"/>
+      <w:spacing w:before="2000"/>
+    </w:pPr>
+    <w:r>
+      <w:drawing>
+        <wp:inline xmlns:a="http://schemas.openxmlformats.org/drawingml/2006/main" xmlns:pic="http://schemas.openxmlformats.org/drawingml/2006/picture">
+          <wp:extent cx="4320000" cy="4320000"/>
+          <wp:docPr id="1" name="Picture 1"/>
+          <wp:cNvGraphicFramePr>
+            <a:graphicFrameLocks noChangeAspect="1"/>
+          </wp:cNvGraphicFramePr>
+          <a:graphic>
+            <a:graphicData uri="http://schemas.openxmlformats.org/drawingml/2006/picture">
+              <pic:pic>
+                <pic:nvPicPr>
+                  <pic:cNvPr id="0" name="watermark.png"/>
+                  <pic:cNvPicPr/>
+                </pic:nvPicPr>
+                <pic:blipFill>
+                  <a:blip r:embed="rId1"/>
+                  <a:stretch>
+                    <a:fillRect/>
+                  </a:stretch>
+                </pic:blipFill>
+                <pic:spPr>
+                  <a:xfrm>
+                    <a:off x="0" y="0"/>
+                    <a:ext cx="4320000" cy="4320000"/>
+                  </a:xfrm>
+                  <a:prstGeom prst="rect"/>
+                </pic:spPr>
+              </pic:pic>
+            </a:graphicData>
+          </a:graphic>
+        </wp:inline>
+      </w:drawing>
+    </w:r>
+  </w:p>
+</w:hdr>
 </file>
 
 <file path=word/numbering.xml><?xml version="1.0" encoding="utf-8"?>
@@ -577,6 +706,10 @@
     <w:name w:val="Normal"/>
     <w:qFormat/>
     <w:rsid w:val="00FC693F"/>
+    <w:rPr>
+      <w:rFonts w:ascii="Noto Sans Devanagari" w:hAnsi="Noto Sans Devanagari" w:cs="Noto Sans Devanagari"/>
+      <w:sz w:val="21"/>
+    </w:rPr>
   </w:style>
   <w:style w:type="paragraph" w:styleId="Header">
     <w:name w:val="header"/>

</xml_diff>

<commit_message>
fix(mgmt): keep single-page DOCX samples on one page (watermark overflow)
The logo watermark was embedded as a large (12cm) INLINE image inside the
page header, which consumes real vertical space and pushed the receipt and
certificate bodies onto a second page in print preview.

Convert the watermark to a floating, behind-text anchored image (behindDoc,
page-centered) so it occupies no space in the content flow, and tighten
header/paragraph spacing. Receipts, material and certificate now fit on a
single page; page sizes, placeholders and text are unchanged.

Regenerated all 9 samples in both the React and Svelte apps and re-verified
they render through docxtemplater + the image module.
</commit_message>
<xml_diff>
--- a/mgmt/frontend-svelte/static/sample-templates/certificate-sample.docx
+++ b/mgmt/frontend-svelte/static/sample-templates/certificate-sample.docx
@@ -4,7 +4,7 @@
   <w:body>
     <w:p>
       <w:pPr>
-        <w:spacing w:after="40"/>
+        <w:spacing w:after="20"/>
         <w:jc w:val="center"/>
       </w:pPr>
       <w:r>
@@ -59,7 +59,7 @@
     </w:p>
     <w:p>
       <w:pPr>
-        <w:spacing w:after="40" w:before="0"/>
+        <w:spacing w:after="20" w:before="0"/>
         <w:jc w:val="center"/>
       </w:pPr>
       <w:r>
@@ -89,7 +89,7 @@
     </w:p>
     <w:p>
       <w:pPr>
-        <w:spacing w:after="40" w:before="0"/>
+        <w:spacing w:after="20" w:before="0"/>
         <w:jc w:val="center"/>
       </w:pPr>
       <w:r>
@@ -104,7 +104,7 @@
     </w:p>
     <w:p>
       <w:pPr>
-        <w:spacing w:after="80" w:before="40"/>
+        <w:spacing w:after="60" w:before="20"/>
         <w:pBdr>
           <w:bottom w:val="single" w:sz="6" w:space="1" w:color="E0C99B"/>
         </w:pBdr>
@@ -112,6 +112,7 @@
     </w:p>
     <w:p>
       <w:pPr>
+        <w:spacing w:after="40"/>
         <w:jc w:val="center"/>
       </w:pPr>
       <w:r>
@@ -124,12 +125,7 @@
     </w:p>
     <w:p>
       <w:pPr>
-        <w:spacing w:after="80" w:before="0"/>
-      </w:pPr>
-    </w:p>
-    <w:p>
-      <w:pPr>
-        <w:spacing w:after="40" w:before="0"/>
+        <w:spacing w:after="20" w:before="40"/>
         <w:jc w:val="center"/>
       </w:pPr>
       <w:r>
@@ -143,7 +139,7 @@
     </w:p>
     <w:p>
       <w:pPr>
-        <w:spacing w:after="120" w:before="0"/>
+        <w:spacing w:after="80" w:before="0"/>
         <w:jc w:val="center"/>
       </w:pPr>
       <w:r>
@@ -158,7 +154,7 @@
     </w:p>
     <w:p>
       <w:pPr>
-        <w:spacing w:after="40" w:before="0"/>
+        <w:spacing w:after="20" w:before="0"/>
         <w:jc w:val="center"/>
       </w:pPr>
       <w:r>
@@ -173,7 +169,7 @@
     </w:p>
     <w:p>
       <w:pPr>
-        <w:spacing w:after="120" w:before="0"/>
+        <w:spacing w:after="80" w:before="0"/>
         <w:jc w:val="center"/>
       </w:pPr>
       <w:r>
@@ -187,7 +183,7 @@
     </w:p>
     <w:p>
       <w:pPr>
-        <w:spacing w:after="40" w:before="0"/>
+        <w:spacing w:after="20" w:before="0"/>
         <w:jc w:val="center"/>
       </w:pPr>
       <w:r>
@@ -201,7 +197,7 @@
     </w:p>
     <w:p>
       <w:pPr>
-        <w:spacing w:after="120" w:before="0"/>
+        <w:spacing w:after="80" w:before="0"/>
         <w:jc w:val="center"/>
       </w:pPr>
       <w:r>
@@ -216,7 +212,7 @@
     </w:p>
     <w:p>
       <w:pPr>
-        <w:spacing w:after="160" w:before="0"/>
+        <w:spacing w:after="80" w:before="0"/>
         <w:jc w:val="center"/>
       </w:pPr>
       <w:r>
@@ -230,7 +226,7 @@
     </w:p>
     <w:p>
       <w:pPr>
-        <w:spacing w:before="120" w:after="40"/>
+        <w:spacing w:before="80" w:after="20"/>
         <w:jc w:val="center"/>
       </w:pPr>
       <w:r>
@@ -251,14 +247,14 @@
           <w:b w:val="0"/>
           <w:i w:val="0"/>
           <w:color w:val="555555"/>
-          <w:sz w:val="17"/>
+          <w:sz w:val="16"/>
         </w:rPr>
         <w:t>यह प्रमाण पत्र डिजिटल रूप से जनरेट किया गया है, अतः किसी हस्ताक्षर की आवश्यकता नहीं है। प्रामाणिकता जाँचने हेतु QR कोड स्कैन करें।</w:t>
       </w:r>
     </w:p>
     <w:p>
       <w:pPr>
-        <w:spacing w:after="40" w:before="0"/>
+        <w:spacing w:after="20" w:before="0"/>
         <w:jc w:val="center"/>
       </w:pPr>
       <w:r>
@@ -266,14 +262,14 @@
           <w:b w:val="0"/>
           <w:i/>
           <w:color w:val="555555"/>
-          <w:sz w:val="16"/>
+          <w:sz w:val="15"/>
         </w:rPr>
         <w:t>This certificate is digitally generated, so no signature is required. Scan the QR code to verify authenticity.</w:t>
       </w:r>
     </w:p>
     <w:p>
       <w:pPr>
-        <w:spacing w:after="80" w:before="40"/>
+        <w:spacing w:after="60" w:before="20"/>
         <w:jc w:val="center"/>
       </w:pPr>
       <w:r>
@@ -289,7 +285,7 @@
     <w:sectPr>
       <w:headerReference w:type="default" r:id="rId9"/>
       <w:pgSz w:w="16838" w:h="11906" w:orient="landscape"/>
-      <w:pgMar w:top="1134" w:right="1134" w:bottom="1134" w:left="1134" w:header="340" w:footer="720" w:gutter="0"/>
+      <w:pgMar w:top="1020" w:right="1020" w:bottom="1020" w:left="1020" w:header="227" w:footer="227" w:gutter="0"/>
       <w:cols w:space="720"/>
       <w:docGrid w:linePitch="360"/>
     </w:sectPr>
@@ -303,13 +299,21 @@
     <w:pPr>
       <w:pStyle w:val="Header"/>
       <w:jc w:val="center"/>
-      <w:spacing w:before="2000"/>
-    </w:pPr>
-    <w:r>
+    </w:pPr>
+    <w:r xmlns:a="http://schemas.openxmlformats.org/drawingml/2006/main" xmlns:pic="http://schemas.openxmlformats.org/drawingml/2006/picture">
       <w:drawing>
-        <wp:inline xmlns:a="http://schemas.openxmlformats.org/drawingml/2006/main" xmlns:pic="http://schemas.openxmlformats.org/drawingml/2006/picture">
-          <wp:extent cx="4320000" cy="4320000"/>
-          <wp:docPr id="1" name="Picture 1"/>
+        <wp:anchor distT="0" distB="0" distL="0" distR="0" simplePos="0" relativeHeight="0" behindDoc="1" locked="0" layoutInCell="1" allowOverlap="1">
+          <wp:simplePos x="0" y="0"/>
+          <wp:positionH relativeFrom="page">
+            <wp:align>center</wp:align>
+          </wp:positionH>
+          <wp:positionV relativeFrom="page">
+            <wp:align>center</wp:align>
+          </wp:positionV>
+          <wp:extent cx="3960000" cy="3960000"/>
+          <wp:effectExtent l="0" t="0" r="0" b="0"/>
+          <wp:wrapNone/>
+          <wp:docPr id="1003" name="Watermark1003"/>
           <wp:cNvGraphicFramePr>
             <a:graphicFrameLocks noChangeAspect="1"/>
           </wp:cNvGraphicFramePr>
@@ -317,7 +321,7 @@
             <a:graphicData uri="http://schemas.openxmlformats.org/drawingml/2006/picture">
               <pic:pic>
                 <pic:nvPicPr>
-                  <pic:cNvPr id="0" name="watermark.png"/>
+                  <pic:cNvPr id="1003" name="Watermark1003"/>
                   <pic:cNvPicPr/>
                 </pic:nvPicPr>
                 <pic:blipFill>
@@ -329,14 +333,16 @@
                 <pic:spPr>
                   <a:xfrm>
                     <a:off x="0" y="0"/>
-                    <a:ext cx="4320000" cy="4320000"/>
+                    <a:ext cx="3960000" cy="3960000"/>
                   </a:xfrm>
-                  <a:prstGeom prst="rect"/>
+                  <a:prstGeom prst="rect">
+                    <a:avLst/>
+                  </a:prstGeom>
                 </pic:spPr>
               </pic:pic>
             </a:graphicData>
           </a:graphic>
-        </wp:inline>
+        </wp:anchor>
       </w:drawing>
     </w:r>
   </w:p>
@@ -706,6 +712,9 @@
     <w:name w:val="Normal"/>
     <w:qFormat/>
     <w:rsid w:val="00FC693F"/>
+    <w:pPr>
+      <w:spacing w:after="0" w:line="240" w:lineRule="auto"/>
+    </w:pPr>
     <w:rPr>
       <w:rFonts w:ascii="Noto Sans Devanagari" w:hAnsi="Noto Sans Devanagari" w:cs="Noto Sans Devanagari"/>
       <w:sz w:val="21"/>

</xml_diff>

<commit_message>
fix(mgmt): keep single-page DOCX samples on one page (watermark overflow) (#306)
The logo watermark was embedded as a large (12cm) INLINE image inside the
page header, which consumes real vertical space and pushed the receipt and
certificate bodies onto a second page in print preview.

Convert the watermark to a floating, behind-text anchored image (behindDoc,
page-centered) so it occupies no space in the content flow, and tighten
header/paragraph spacing. Receipts, material and certificate now fit on a
single page; page sizes, placeholders and text are unchanged.

Regenerated all 9 samples in both the React and Svelte apps and re-verified
they render through docxtemplater + the image module.

Co-authored-by: Kiro Agent <244629292+kiro-agent@users.noreply.github.com>
</commit_message>
<xml_diff>
--- a/mgmt/frontend-svelte/static/sample-templates/certificate-sample.docx
+++ b/mgmt/frontend-svelte/static/sample-templates/certificate-sample.docx
@@ -4,7 +4,7 @@
   <w:body>
     <w:p>
       <w:pPr>
-        <w:spacing w:after="40"/>
+        <w:spacing w:after="20"/>
         <w:jc w:val="center"/>
       </w:pPr>
       <w:r>
@@ -59,7 +59,7 @@
     </w:p>
     <w:p>
       <w:pPr>
-        <w:spacing w:after="40" w:before="0"/>
+        <w:spacing w:after="20" w:before="0"/>
         <w:jc w:val="center"/>
       </w:pPr>
       <w:r>
@@ -89,7 +89,7 @@
     </w:p>
     <w:p>
       <w:pPr>
-        <w:spacing w:after="40" w:before="0"/>
+        <w:spacing w:after="20" w:before="0"/>
         <w:jc w:val="center"/>
       </w:pPr>
       <w:r>
@@ -104,7 +104,7 @@
     </w:p>
     <w:p>
       <w:pPr>
-        <w:spacing w:after="80" w:before="40"/>
+        <w:spacing w:after="60" w:before="20"/>
         <w:pBdr>
           <w:bottom w:val="single" w:sz="6" w:space="1" w:color="E0C99B"/>
         </w:pBdr>
@@ -112,6 +112,7 @@
     </w:p>
     <w:p>
       <w:pPr>
+        <w:spacing w:after="40"/>
         <w:jc w:val="center"/>
       </w:pPr>
       <w:r>
@@ -124,12 +125,7 @@
     </w:p>
     <w:p>
       <w:pPr>
-        <w:spacing w:after="80" w:before="0"/>
-      </w:pPr>
-    </w:p>
-    <w:p>
-      <w:pPr>
-        <w:spacing w:after="40" w:before="0"/>
+        <w:spacing w:after="20" w:before="40"/>
         <w:jc w:val="center"/>
       </w:pPr>
       <w:r>
@@ -143,7 +139,7 @@
     </w:p>
     <w:p>
       <w:pPr>
-        <w:spacing w:after="120" w:before="0"/>
+        <w:spacing w:after="80" w:before="0"/>
         <w:jc w:val="center"/>
       </w:pPr>
       <w:r>
@@ -158,7 +154,7 @@
     </w:p>
     <w:p>
       <w:pPr>
-        <w:spacing w:after="40" w:before="0"/>
+        <w:spacing w:after="20" w:before="0"/>
         <w:jc w:val="center"/>
       </w:pPr>
       <w:r>
@@ -173,7 +169,7 @@
     </w:p>
     <w:p>
       <w:pPr>
-        <w:spacing w:after="120" w:before="0"/>
+        <w:spacing w:after="80" w:before="0"/>
         <w:jc w:val="center"/>
       </w:pPr>
       <w:r>
@@ -187,7 +183,7 @@
     </w:p>
     <w:p>
       <w:pPr>
-        <w:spacing w:after="40" w:before="0"/>
+        <w:spacing w:after="20" w:before="0"/>
         <w:jc w:val="center"/>
       </w:pPr>
       <w:r>
@@ -201,7 +197,7 @@
     </w:p>
     <w:p>
       <w:pPr>
-        <w:spacing w:after="120" w:before="0"/>
+        <w:spacing w:after="80" w:before="0"/>
         <w:jc w:val="center"/>
       </w:pPr>
       <w:r>
@@ -216,7 +212,7 @@
     </w:p>
     <w:p>
       <w:pPr>
-        <w:spacing w:after="160" w:before="0"/>
+        <w:spacing w:after="80" w:before="0"/>
         <w:jc w:val="center"/>
       </w:pPr>
       <w:r>
@@ -230,7 +226,7 @@
     </w:p>
     <w:p>
       <w:pPr>
-        <w:spacing w:before="120" w:after="40"/>
+        <w:spacing w:before="80" w:after="20"/>
         <w:jc w:val="center"/>
       </w:pPr>
       <w:r>
@@ -251,14 +247,14 @@
           <w:b w:val="0"/>
           <w:i w:val="0"/>
           <w:color w:val="555555"/>
-          <w:sz w:val="17"/>
+          <w:sz w:val="16"/>
         </w:rPr>
         <w:t>यह प्रमाण पत्र डिजिटल रूप से जनरेट किया गया है, अतः किसी हस्ताक्षर की आवश्यकता नहीं है। प्रामाणिकता जाँचने हेतु QR कोड स्कैन करें।</w:t>
       </w:r>
     </w:p>
     <w:p>
       <w:pPr>
-        <w:spacing w:after="40" w:before="0"/>
+        <w:spacing w:after="20" w:before="0"/>
         <w:jc w:val="center"/>
       </w:pPr>
       <w:r>
@@ -266,14 +262,14 @@
           <w:b w:val="0"/>
           <w:i/>
           <w:color w:val="555555"/>
-          <w:sz w:val="16"/>
+          <w:sz w:val="15"/>
         </w:rPr>
         <w:t>This certificate is digitally generated, so no signature is required. Scan the QR code to verify authenticity.</w:t>
       </w:r>
     </w:p>
     <w:p>
       <w:pPr>
-        <w:spacing w:after="80" w:before="40"/>
+        <w:spacing w:after="60" w:before="20"/>
         <w:jc w:val="center"/>
       </w:pPr>
       <w:r>
@@ -289,7 +285,7 @@
     <w:sectPr>
       <w:headerReference w:type="default" r:id="rId9"/>
       <w:pgSz w:w="16838" w:h="11906" w:orient="landscape"/>
-      <w:pgMar w:top="1134" w:right="1134" w:bottom="1134" w:left="1134" w:header="340" w:footer="720" w:gutter="0"/>
+      <w:pgMar w:top="1020" w:right="1020" w:bottom="1020" w:left="1020" w:header="227" w:footer="227" w:gutter="0"/>
       <w:cols w:space="720"/>
       <w:docGrid w:linePitch="360"/>
     </w:sectPr>
@@ -303,13 +299,21 @@
     <w:pPr>
       <w:pStyle w:val="Header"/>
       <w:jc w:val="center"/>
-      <w:spacing w:before="2000"/>
-    </w:pPr>
-    <w:r>
+    </w:pPr>
+    <w:r xmlns:a="http://schemas.openxmlformats.org/drawingml/2006/main" xmlns:pic="http://schemas.openxmlformats.org/drawingml/2006/picture">
       <w:drawing>
-        <wp:inline xmlns:a="http://schemas.openxmlformats.org/drawingml/2006/main" xmlns:pic="http://schemas.openxmlformats.org/drawingml/2006/picture">
-          <wp:extent cx="4320000" cy="4320000"/>
-          <wp:docPr id="1" name="Picture 1"/>
+        <wp:anchor distT="0" distB="0" distL="0" distR="0" simplePos="0" relativeHeight="0" behindDoc="1" locked="0" layoutInCell="1" allowOverlap="1">
+          <wp:simplePos x="0" y="0"/>
+          <wp:positionH relativeFrom="page">
+            <wp:align>center</wp:align>
+          </wp:positionH>
+          <wp:positionV relativeFrom="page">
+            <wp:align>center</wp:align>
+          </wp:positionV>
+          <wp:extent cx="3960000" cy="3960000"/>
+          <wp:effectExtent l="0" t="0" r="0" b="0"/>
+          <wp:wrapNone/>
+          <wp:docPr id="1003" name="Watermark1003"/>
           <wp:cNvGraphicFramePr>
             <a:graphicFrameLocks noChangeAspect="1"/>
           </wp:cNvGraphicFramePr>
@@ -317,7 +321,7 @@
             <a:graphicData uri="http://schemas.openxmlformats.org/drawingml/2006/picture">
               <pic:pic>
                 <pic:nvPicPr>
-                  <pic:cNvPr id="0" name="watermark.png"/>
+                  <pic:cNvPr id="1003" name="Watermark1003"/>
                   <pic:cNvPicPr/>
                 </pic:nvPicPr>
                 <pic:blipFill>
@@ -329,14 +333,16 @@
                 <pic:spPr>
                   <a:xfrm>
                     <a:off x="0" y="0"/>
-                    <a:ext cx="4320000" cy="4320000"/>
+                    <a:ext cx="3960000" cy="3960000"/>
                   </a:xfrm>
-                  <a:prstGeom prst="rect"/>
+                  <a:prstGeom prst="rect">
+                    <a:avLst/>
+                  </a:prstGeom>
                 </pic:spPr>
               </pic:pic>
             </a:graphicData>
           </a:graphic>
-        </wp:inline>
+        </wp:anchor>
       </w:drawing>
     </w:r>
   </w:p>
@@ -706,6 +712,9 @@
     <w:name w:val="Normal"/>
     <w:qFormat/>
     <w:rsid w:val="00FC693F"/>
+    <w:pPr>
+      <w:spacing w:after="0" w:line="240" w:lineRule="auto"/>
+    </w:pPr>
     <w:rPr>
       <w:rFonts w:ascii="Noto Sans Devanagari" w:hAnsi="Noto Sans Devanagari" w:cs="Noto Sans Devanagari"/>
       <w:sz w:val="21"/>

</xml_diff>